<commit_message>
cập nhật luồng chức năng
</commit_message>
<xml_diff>
--- a/docs/Luồng chức năng của đồ án IE213.docx
+++ b/docs/Luồng chức năng của đồ án IE213.docx
@@ -5,6 +5,32 @@
     <w:p>
       <w:pPr>
         <w:rPr>
+          <w:rFonts w:ascii="Times New Roman" w:hAnsi="Times New Roman" w:cs="Times New Roman"/>
+          <w:sz w:val="26"/>
+          <w:szCs w:val="26"/>
+        </w:rPr>
+      </w:pPr>
+      <w:r>
+        <w:rPr>
+          <w:b/>
+          <w:bCs/>
+          <w:sz w:val="26"/>
+          <w:szCs w:val="26"/>
+        </w:rPr>
+        <w:t xml:space="preserve">Công nghệ sử dụng: </w:t>
+      </w:r>
+      <w:r>
+        <w:rPr>
+          <w:rFonts w:ascii="Times New Roman" w:hAnsi="Times New Roman" w:cs="Times New Roman"/>
+          <w:sz w:val="26"/>
+          <w:szCs w:val="26"/>
+        </w:rPr>
+        <w:t>MERN (MongoDB, Express.js, React.js, Node.js), JWT, Solidity, Sepolia, Pinata, MetaMask, Blockchain (Ethereum)</w:t>
+      </w:r>
+    </w:p>
+    <w:p>
+      <w:pPr>
+        <w:rPr>
           <w:b/>
           <w:bCs/>
         </w:rPr>
@@ -152,7 +178,7 @@
     <w:p>
       <w:r>
         <w:pict w14:anchorId="4634E97D">
-          <v:rect id="_x0000_i1049" style="width:0;height:1.5pt" o:hralign="center" o:hrstd="t" o:hr="t" fillcolor="#a0a0a0" stroked="f"/>
+          <v:rect id="_x0000_i1025" style="width:0;height:1.5pt" o:hralign="center" o:hrstd="t" o:hr="t" fillcolor="#a0a0a0" stroked="f"/>
         </w:pict>
       </w:r>
     </w:p>
@@ -257,7 +283,7 @@
     <w:p>
       <w:r>
         <w:pict w14:anchorId="76EE3AB2">
-          <v:rect id="_x0000_i1050" style="width:0;height:1.5pt" o:hralign="center" o:hrstd="t" o:hr="t" fillcolor="#a0a0a0" stroked="f"/>
+          <v:rect id="_x0000_i1026" style="width:0;height:1.5pt" o:hralign="center" o:hrstd="t" o:hr="t" fillcolor="#a0a0a0" stroked="f"/>
         </w:pict>
       </w:r>
     </w:p>
@@ -278,6 +304,7 @@
     </w:p>
     <w:p>
       <w:r>
+        <w:lastRenderedPageBreak/>
         <w:t>Trạm kiểm định là người nắm giữ quyền lực chốt dữ liệu lên Blockchain, nên họ phải định danh bằng Ví MetaMask.</w:t>
       </w:r>
     </w:p>
@@ -293,7 +320,6 @@
           <w:b/>
           <w:bCs/>
         </w:rPr>
-        <w:lastRenderedPageBreak/>
         <w:t>Bước 1 (Kết nối):</w:t>
       </w:r>
       <w:r>
@@ -379,7 +405,7 @@
     <w:p>
       <w:r>
         <w:pict w14:anchorId="2C4EBA26">
-          <v:rect id="_x0000_i1051" style="width:0;height:1.5pt" o:hralign="center" o:hrstd="t" o:hr="t" fillcolor="#a0a0a0" stroked="f"/>
+          <v:rect id="_x0000_i1027" style="width:0;height:1.5pt" o:hralign="center" o:hrstd="t" o:hr="t" fillcolor="#a0a0a0" stroked="f"/>
         </w:pict>
       </w:r>
     </w:p>
@@ -502,7 +528,7 @@
     <w:p>
       <w:r>
         <w:pict w14:anchorId="63480477">
-          <v:rect id="_x0000_i1052" style="width:0;height:1.5pt" o:hralign="center" o:hrstd="t" o:hr="t" fillcolor="#a0a0a0" stroked="f"/>
+          <v:rect id="_x0000_i1028" style="width:0;height:1.5pt" o:hralign="center" o:hrstd="t" o:hr="t" fillcolor="#a0a0a0" stroked="f"/>
         </w:pict>
       </w:r>
     </w:p>
@@ -576,6 +602,7 @@
           <w:b/>
           <w:bCs/>
         </w:rPr>
+        <w:lastRenderedPageBreak/>
         <w:t>Bước 2 (Truy xuất nhanh):</w:t>
       </w:r>
       <w:r>
@@ -600,7 +627,6 @@
           <w:b/>
           <w:bCs/>
         </w:rPr>
-        <w:lastRenderedPageBreak/>
         <w:t>Bước 3 (Bằng chứng thép):</w:t>
       </w:r>
       <w:r>
@@ -2013,6 +2039,7 @@
   <w:style w:type="character" w:default="1" w:styleId="DefaultParagraphFont">
     <w:name w:val="Default Paragraph Font"/>
     <w:uiPriority w:val="1"/>
+    <w:semiHidden/>
     <w:unhideWhenUsed/>
   </w:style>
   <w:style w:type="table" w:default="1" w:styleId="TableNormal">

</xml_diff>